<commit_message>
Modelos de clases, disenados con staruml
</commit_message>
<xml_diff>
--- a/Documentacion/01 Acta de Constitucion.docx
+++ b/Documentacion/01 Acta de Constitucion.docx
@@ -1,6 +1,6 @@
 
 <file path=word/document.xml><?xml version="1.0" encoding="utf-8"?>
-<w:document xmlns:wpc="http://schemas.microsoft.com/office/word/2010/wordprocessingCanvas" xmlns:cx="http://schemas.microsoft.com/office/drawing/2014/chartex" xmlns:cx1="http://schemas.microsoft.com/office/drawing/2015/9/8/chartex" xmlns:cx2="http://schemas.microsoft.com/office/drawing/2015/10/21/chartex" xmlns:cx3="http://schemas.microsoft.com/office/drawing/2016/5/9/chartex" xmlns:cx4="http://schemas.microsoft.com/office/drawing/2016/5/10/chartex" xmlns:cx5="http://schemas.microsoft.com/office/drawing/2016/5/11/chartex" xmlns:cx6="http://schemas.microsoft.com/office/drawing/2016/5/12/chartex" xmlns:cx7="http://schemas.microsoft.com/office/drawing/2016/5/13/chartex" xmlns:cx8="http://schemas.microsoft.com/office/drawing/2016/5/14/chartex" xmlns:mc="http://schemas.openxmlformats.org/markup-compatibility/2006" xmlns:aink="http://schemas.microsoft.com/office/drawing/2016/ink" xmlns:am3d="http://schemas.microsoft.com/office/drawing/2017/model3d" xmlns:o="urn:schemas-microsoft-com:office:office" xmlns:oel="http://schemas.microsoft.com/office/2019/extlst" xmlns:r="http://schemas.openxmlformats.org/officeDocument/2006/relationships" xmlns:m="http://schemas.openxmlformats.org/officeDocument/2006/math" xmlns:v="urn:schemas-microsoft-com:vml" xmlns:wp14="http://schemas.microsoft.com/office/word/2010/wordprocessingDrawing" xmlns:wp="http://schemas.openxmlformats.org/drawingml/2006/wordprocessingDrawing" xmlns:w10="urn:schemas-microsoft-com:office:word" xmlns:w="http://schemas.openxmlformats.org/wordprocessingml/2006/main" xmlns:w14="http://schemas.microsoft.com/office/word/2010/wordml" xmlns:w15="http://schemas.microsoft.com/office/word/2012/wordml" xmlns:w16cei="http://schemas.microsoft.com/office/word/2026/wordml/cei" xmlns:w16cex="http://schemas.microsoft.com/office/word/2018/wordml/cex" xmlns:w16cid="http://schemas.microsoft.com/office/word/2016/wordml/cid" xmlns:w16="http://schemas.microsoft.com/office/word/2018/wordml" xmlns:w16du="http://schemas.microsoft.com/office/word/2023/wordml/word16du" xmlns:w16sdtdh="http://schemas.microsoft.com/office/word/2020/wordml/sdtdatahash" xmlns:w16sdtfl="http://schemas.microsoft.com/office/word/2024/wordml/sdtformatlock" xmlns:w16se="http://schemas.microsoft.com/office/word/2015/wordml/symex" xmlns:wpg="http://schemas.microsoft.com/office/word/2010/wordprocessingGroup" xmlns:wpi="http://schemas.microsoft.com/office/word/2010/wordprocessingInk" xmlns:wne="http://schemas.microsoft.com/office/word/2006/wordml" xmlns:wps="http://schemas.microsoft.com/office/word/2010/wordprocessingShape" mc:Ignorable="w14 w15 w16se w16cid w16 w16cex w16sdtdh w16sdtfl w16du wp14">
+<w:document xmlns:wpc="http://schemas.microsoft.com/office/word/2010/wordprocessingCanvas" xmlns:cx="http://schemas.microsoft.com/office/drawing/2014/chartex" xmlns:cx1="http://schemas.microsoft.com/office/drawing/2015/9/8/chartex" xmlns:cx2="http://schemas.microsoft.com/office/drawing/2015/10/21/chartex" xmlns:cx3="http://schemas.microsoft.com/office/drawing/2016/5/9/chartex" xmlns:cx4="http://schemas.microsoft.com/office/drawing/2016/5/10/chartex" xmlns:cx5="http://schemas.microsoft.com/office/drawing/2016/5/11/chartex" xmlns:cx6="http://schemas.microsoft.com/office/drawing/2016/5/12/chartex" xmlns:cx7="http://schemas.microsoft.com/office/drawing/2016/5/13/chartex" xmlns:cx8="http://schemas.microsoft.com/office/drawing/2016/5/14/chartex" xmlns:mc="http://schemas.openxmlformats.org/markup-compatibility/2006" xmlns:aink="http://schemas.microsoft.com/office/drawing/2016/ink" xmlns:am3d="http://schemas.microsoft.com/office/drawing/2017/model3d" xmlns:o="urn:schemas-microsoft-com:office:office" xmlns:oel="http://schemas.microsoft.com/office/2019/extlst" xmlns:r="http://schemas.openxmlformats.org/officeDocument/2006/relationships" xmlns:m="http://schemas.openxmlformats.org/officeDocument/2006/math" xmlns:v="urn:schemas-microsoft-com:vml" xmlns:wp14="http://schemas.microsoft.com/office/word/2010/wordprocessingDrawing" xmlns:wp="http://schemas.openxmlformats.org/drawingml/2006/wordprocessingDrawing" xmlns:w10="urn:schemas-microsoft-com:office:word" xmlns:w="http://schemas.openxmlformats.org/wordprocessingml/2006/main" xmlns:w14="http://schemas.microsoft.com/office/word/2010/wordml" xmlns:w15="http://schemas.microsoft.com/office/word/2012/wordml" xmlns:w16cex="http://schemas.microsoft.com/office/word/2018/wordml/cex" xmlns:w16cid="http://schemas.microsoft.com/office/word/2016/wordml/cid" xmlns:w16="http://schemas.microsoft.com/office/word/2018/wordml" xmlns:w16du="http://schemas.microsoft.com/office/word/2023/wordml/word16du" xmlns:w16sdtdh="http://schemas.microsoft.com/office/word/2020/wordml/sdtdatahash" xmlns:w16sdtfl="http://schemas.microsoft.com/office/word/2024/wordml/sdtformatlock" xmlns:w16se="http://schemas.microsoft.com/office/word/2015/wordml/symex" xmlns:wpg="http://schemas.microsoft.com/office/word/2010/wordprocessingGroup" xmlns:wpi="http://schemas.microsoft.com/office/word/2010/wordprocessingInk" xmlns:wne="http://schemas.microsoft.com/office/word/2006/wordml" xmlns:wps="http://schemas.microsoft.com/office/word/2010/wordprocessingShape" mc:Ignorable="w14 w15 w16se w16cid w16 w16cex w16sdtdh w16sdtfl w16du wp14">
   <w:body>
     <w:p>
       <w:pPr>
@@ -843,7 +843,34 @@
                 <w:szCs w:val="28"/>
                 <w:lang w:val="es-419"/>
               </w:rPr>
-              <w:t>29 de agosto de 2026</w:t>
+              <w:t>05</w:t>
+            </w:r>
+            <w:r>
+              <w:rPr>
+                <w:rFonts w:ascii="Verdana" w:hAnsi="Verdana" w:cs="Times New Roman"/>
+                <w:sz w:val="28"/>
+                <w:szCs w:val="28"/>
+                <w:lang w:val="es-419"/>
+              </w:rPr>
+              <w:t xml:space="preserve"> de </w:t>
+            </w:r>
+            <w:r>
+              <w:rPr>
+                <w:rFonts w:ascii="Verdana" w:hAnsi="Verdana" w:cs="Times New Roman"/>
+                <w:sz w:val="28"/>
+                <w:szCs w:val="28"/>
+                <w:lang w:val="es-419"/>
+              </w:rPr>
+              <w:t>septiembre</w:t>
+            </w:r>
+            <w:r>
+              <w:rPr>
+                <w:rFonts w:ascii="Verdana" w:hAnsi="Verdana" w:cs="Times New Roman"/>
+                <w:sz w:val="28"/>
+                <w:szCs w:val="28"/>
+                <w:lang w:val="es-419"/>
+              </w:rPr>
+              <w:t xml:space="preserve"> de 2026</w:t>
             </w:r>
           </w:p>
         </w:tc>
@@ -5377,7 +5404,28 @@
                 <w:rFonts w:ascii="Verdana" w:hAnsi="Verdana"/>
                 <w:lang w:val="es-419"/>
               </w:rPr>
-              <w:t>21/08/2026</w:t>
+              <w:t>05</w:t>
+            </w:r>
+            <w:r>
+              <w:rPr>
+                <w:rFonts w:ascii="Verdana" w:hAnsi="Verdana"/>
+                <w:lang w:val="es-419"/>
+              </w:rPr>
+              <w:t>/</w:t>
+            </w:r>
+            <w:r>
+              <w:rPr>
+                <w:rFonts w:ascii="Verdana" w:hAnsi="Verdana"/>
+                <w:lang w:val="es-419"/>
+              </w:rPr>
+              <w:t>09</w:t>
+            </w:r>
+            <w:r>
+              <w:rPr>
+                <w:rFonts w:ascii="Verdana" w:hAnsi="Verdana"/>
+                <w:lang w:val="es-419"/>
+              </w:rPr>
+              <w:t>/2026</w:t>
             </w:r>
           </w:p>
         </w:tc>
@@ -7183,18 +7231,7 @@
                 <w:szCs w:val="24"/>
                 <w:lang w:val="es-419"/>
               </w:rPr>
-              <w:t>.</w:t>
-            </w:r>
-            <w:r>
-              <w:rPr>
-                <w:rFonts w:ascii="Verdana" w:hAnsi="Verdana"/>
-                <w:bCs/>
-                <w:iCs/>
-                <w:sz w:val="24"/>
-                <w:szCs w:val="24"/>
-                <w:lang w:val="es-419"/>
-              </w:rPr>
-              <w:t>º</w:t>
+              <w:t>.º</w:t>
             </w:r>
             <w:r>
               <w:rPr>
@@ -8756,13 +8793,11 @@
               <w:jc w:val="both"/>
               <w:rPr>
                 <w:rFonts w:ascii="Verdana" w:hAnsi="Verdana"/>
-                <w:lang w:val="es-419"/>
-              </w:rPr>
-            </w:pPr>
-            <w:r>
-              <w:rPr>
-                <w:rFonts w:ascii="Verdana" w:hAnsi="Verdana"/>
-                <w:lang w:val="es-419"/>
+              </w:rPr>
+            </w:pPr>
+            <w:r>
+              <w:rPr>
+                <w:rFonts w:ascii="Verdana" w:hAnsi="Verdana"/>
               </w:rPr>
               <w:t>Product Owner y Scrum Master</w:t>
             </w:r>
@@ -9929,14 +9964,7 @@
                 <w:rFonts w:ascii="Verdana" w:hAnsi="Verdana"/>
                 <w:lang w:val="es-419"/>
               </w:rPr>
-              <w:t>Mario Luzardo Fierro</w:t>
-            </w:r>
-            <w:r>
-              <w:rPr>
-                <w:rFonts w:ascii="Verdana" w:hAnsi="Verdana"/>
-                <w:lang w:val="es-419"/>
-              </w:rPr>
-              <w:t xml:space="preserve"> </w:t>
+              <w:t xml:space="preserve">Mario Luzardo Fierro </w:t>
             </w:r>
           </w:p>
         </w:tc>
@@ -11740,28 +11768,7 @@
                 <w:rFonts w:ascii="Verdana" w:hAnsi="Verdana"/>
                 <w:lang w:val="es-419"/>
               </w:rPr>
-              <w:t>03</w:t>
-            </w:r>
-            <w:r>
-              <w:rPr>
-                <w:rFonts w:ascii="Verdana" w:hAnsi="Verdana"/>
-                <w:lang w:val="es-419"/>
-              </w:rPr>
-              <w:t>/</w:t>
-            </w:r>
-            <w:r>
-              <w:rPr>
-                <w:rFonts w:ascii="Verdana" w:hAnsi="Verdana"/>
-                <w:lang w:val="es-419"/>
-              </w:rPr>
-              <w:t>10</w:t>
-            </w:r>
-            <w:r>
-              <w:rPr>
-                <w:rFonts w:ascii="Verdana" w:hAnsi="Verdana"/>
-                <w:lang w:val="es-419"/>
-              </w:rPr>
-              <w:t>/2026</w:t>
+              <w:t>03/10/2026</w:t>
             </w:r>
           </w:p>
         </w:tc>
@@ -14486,13 +14493,11 @@
               <w:jc w:val="both"/>
               <w:rPr>
                 <w:rFonts w:ascii="Verdana" w:hAnsi="Verdana"/>
-                <w:lang w:val="es-419"/>
-              </w:rPr>
-            </w:pPr>
-            <w:r>
-              <w:rPr>
-                <w:rFonts w:ascii="Verdana" w:hAnsi="Verdana"/>
-                <w:lang w:val="es-419"/>
+              </w:rPr>
+            </w:pPr>
+            <w:r>
+              <w:rPr>
+                <w:rFonts w:ascii="Verdana" w:hAnsi="Verdana"/>
               </w:rPr>
               <w:t>Google Drive y Google Docs</w:t>
             </w:r>
@@ -15685,7 +15690,7 @@
 </file>
 
 <file path=word/endnotes.xml><?xml version="1.0" encoding="utf-8"?>
-<w:endnotes xmlns:wpc="http://schemas.microsoft.com/office/word/2010/wordprocessingCanvas" xmlns:cx="http://schemas.microsoft.com/office/drawing/2014/chartex" xmlns:cx1="http://schemas.microsoft.com/office/drawing/2015/9/8/chartex" xmlns:cx2="http://schemas.microsoft.com/office/drawing/2015/10/21/chartex" xmlns:cx3="http://schemas.microsoft.com/office/drawing/2016/5/9/chartex" xmlns:cx4="http://schemas.microsoft.com/office/drawing/2016/5/10/chartex" xmlns:cx5="http://schemas.microsoft.com/office/drawing/2016/5/11/chartex" xmlns:cx6="http://schemas.microsoft.com/office/drawing/2016/5/12/chartex" xmlns:cx7="http://schemas.microsoft.com/office/drawing/2016/5/13/chartex" xmlns:cx8="http://schemas.microsoft.com/office/drawing/2016/5/14/chartex" xmlns:mc="http://schemas.openxmlformats.org/markup-compatibility/2006" xmlns:aink="http://schemas.microsoft.com/office/drawing/2016/ink" xmlns:am3d="http://schemas.microsoft.com/office/drawing/2017/model3d" xmlns:o="urn:schemas-microsoft-com:office:office" xmlns:oel="http://schemas.microsoft.com/office/2019/extlst" xmlns:r="http://schemas.openxmlformats.org/officeDocument/2006/relationships" xmlns:m="http://schemas.openxmlformats.org/officeDocument/2006/math" xmlns:v="urn:schemas-microsoft-com:vml" xmlns:wp14="http://schemas.microsoft.com/office/word/2010/wordprocessingDrawing" xmlns:wp="http://schemas.openxmlformats.org/drawingml/2006/wordprocessingDrawing" xmlns:w10="urn:schemas-microsoft-com:office:word" xmlns:w="http://schemas.openxmlformats.org/wordprocessingml/2006/main" xmlns:w14="http://schemas.microsoft.com/office/word/2010/wordml" xmlns:w15="http://schemas.microsoft.com/office/word/2012/wordml" xmlns:w16cei="http://schemas.microsoft.com/office/word/2026/wordml/cei" xmlns:w16cex="http://schemas.microsoft.com/office/word/2018/wordml/cex" xmlns:w16cid="http://schemas.microsoft.com/office/word/2016/wordml/cid" xmlns:w16="http://schemas.microsoft.com/office/word/2018/wordml" xmlns:w16du="http://schemas.microsoft.com/office/word/2023/wordml/word16du" xmlns:w16sdtdh="http://schemas.microsoft.com/office/word/2020/wordml/sdtdatahash" xmlns:w16sdtfl="http://schemas.microsoft.com/office/word/2024/wordml/sdtformatlock" xmlns:w16se="http://schemas.microsoft.com/office/word/2015/wordml/symex" xmlns:wpg="http://schemas.microsoft.com/office/word/2010/wordprocessingGroup" xmlns:wpi="http://schemas.microsoft.com/office/word/2010/wordprocessingInk" xmlns:wne="http://schemas.microsoft.com/office/word/2006/wordml" xmlns:wps="http://schemas.microsoft.com/office/word/2010/wordprocessingShape" mc:Ignorable="w14 w15 w16se w16cid w16 w16cex w16sdtdh w16sdtfl w16du wp14">
+<w:endnotes xmlns:wpc="http://schemas.microsoft.com/office/word/2010/wordprocessingCanvas" xmlns:cx="http://schemas.microsoft.com/office/drawing/2014/chartex" xmlns:cx1="http://schemas.microsoft.com/office/drawing/2015/9/8/chartex" xmlns:cx2="http://schemas.microsoft.com/office/drawing/2015/10/21/chartex" xmlns:cx3="http://schemas.microsoft.com/office/drawing/2016/5/9/chartex" xmlns:cx4="http://schemas.microsoft.com/office/drawing/2016/5/10/chartex" xmlns:cx5="http://schemas.microsoft.com/office/drawing/2016/5/11/chartex" xmlns:cx6="http://schemas.microsoft.com/office/drawing/2016/5/12/chartex" xmlns:cx7="http://schemas.microsoft.com/office/drawing/2016/5/13/chartex" xmlns:cx8="http://schemas.microsoft.com/office/drawing/2016/5/14/chartex" xmlns:mc="http://schemas.openxmlformats.org/markup-compatibility/2006" xmlns:aink="http://schemas.microsoft.com/office/drawing/2016/ink" xmlns:am3d="http://schemas.microsoft.com/office/drawing/2017/model3d" xmlns:o="urn:schemas-microsoft-com:office:office" xmlns:oel="http://schemas.microsoft.com/office/2019/extlst" xmlns:r="http://schemas.openxmlformats.org/officeDocument/2006/relationships" xmlns:m="http://schemas.openxmlformats.org/officeDocument/2006/math" xmlns:v="urn:schemas-microsoft-com:vml" xmlns:wp14="http://schemas.microsoft.com/office/word/2010/wordprocessingDrawing" xmlns:wp="http://schemas.openxmlformats.org/drawingml/2006/wordprocessingDrawing" xmlns:w10="urn:schemas-microsoft-com:office:word" xmlns:w="http://schemas.openxmlformats.org/wordprocessingml/2006/main" xmlns:w14="http://schemas.microsoft.com/office/word/2010/wordml" xmlns:w15="http://schemas.microsoft.com/office/word/2012/wordml" xmlns:w16cex="http://schemas.microsoft.com/office/word/2018/wordml/cex" xmlns:w16cid="http://schemas.microsoft.com/office/word/2016/wordml/cid" xmlns:w16="http://schemas.microsoft.com/office/word/2018/wordml" xmlns:w16du="http://schemas.microsoft.com/office/word/2023/wordml/word16du" xmlns:w16sdtdh="http://schemas.microsoft.com/office/word/2020/wordml/sdtdatahash" xmlns:w16sdtfl="http://schemas.microsoft.com/office/word/2024/wordml/sdtformatlock" xmlns:w16se="http://schemas.microsoft.com/office/word/2015/wordml/symex" xmlns:wpg="http://schemas.microsoft.com/office/word/2010/wordprocessingGroup" xmlns:wpi="http://schemas.microsoft.com/office/word/2010/wordprocessingInk" xmlns:wne="http://schemas.microsoft.com/office/word/2006/wordml" xmlns:wps="http://schemas.microsoft.com/office/word/2010/wordprocessingShape" mc:Ignorable="w14 w15 w16se w16cid w16 w16cex w16sdtdh w16sdtfl w16du wp14">
   <w:endnote w:type="separator" w:id="-1">
     <w:p>
       <w:pPr>
@@ -15710,7 +15715,7 @@
 </file>
 
 <file path=word/footnotes.xml><?xml version="1.0" encoding="utf-8"?>
-<w:footnotes xmlns:wpc="http://schemas.microsoft.com/office/word/2010/wordprocessingCanvas" xmlns:cx="http://schemas.microsoft.com/office/drawing/2014/chartex" xmlns:cx1="http://schemas.microsoft.com/office/drawing/2015/9/8/chartex" xmlns:cx2="http://schemas.microsoft.com/office/drawing/2015/10/21/chartex" xmlns:cx3="http://schemas.microsoft.com/office/drawing/2016/5/9/chartex" xmlns:cx4="http://schemas.microsoft.com/office/drawing/2016/5/10/chartex" xmlns:cx5="http://schemas.microsoft.com/office/drawing/2016/5/11/chartex" xmlns:cx6="http://schemas.microsoft.com/office/drawing/2016/5/12/chartex" xmlns:cx7="http://schemas.microsoft.com/office/drawing/2016/5/13/chartex" xmlns:cx8="http://schemas.microsoft.com/office/drawing/2016/5/14/chartex" xmlns:mc="http://schemas.openxmlformats.org/markup-compatibility/2006" xmlns:aink="http://schemas.microsoft.com/office/drawing/2016/ink" xmlns:am3d="http://schemas.microsoft.com/office/drawing/2017/model3d" xmlns:o="urn:schemas-microsoft-com:office:office" xmlns:oel="http://schemas.microsoft.com/office/2019/extlst" xmlns:r="http://schemas.openxmlformats.org/officeDocument/2006/relationships" xmlns:m="http://schemas.openxmlformats.org/officeDocument/2006/math" xmlns:v="urn:schemas-microsoft-com:vml" xmlns:wp14="http://schemas.microsoft.com/office/word/2010/wordprocessingDrawing" xmlns:wp="http://schemas.openxmlformats.org/drawingml/2006/wordprocessingDrawing" xmlns:w10="urn:schemas-microsoft-com:office:word" xmlns:w="http://schemas.openxmlformats.org/wordprocessingml/2006/main" xmlns:w14="http://schemas.microsoft.com/office/word/2010/wordml" xmlns:w15="http://schemas.microsoft.com/office/word/2012/wordml" xmlns:w16cei="http://schemas.microsoft.com/office/word/2026/wordml/cei" xmlns:w16cex="http://schemas.microsoft.com/office/word/2018/wordml/cex" xmlns:w16cid="http://schemas.microsoft.com/office/word/2016/wordml/cid" xmlns:w16="http://schemas.microsoft.com/office/word/2018/wordml" xmlns:w16du="http://schemas.microsoft.com/office/word/2023/wordml/word16du" xmlns:w16sdtdh="http://schemas.microsoft.com/office/word/2020/wordml/sdtdatahash" xmlns:w16sdtfl="http://schemas.microsoft.com/office/word/2024/wordml/sdtformatlock" xmlns:w16se="http://schemas.microsoft.com/office/word/2015/wordml/symex" xmlns:wpg="http://schemas.microsoft.com/office/word/2010/wordprocessingGroup" xmlns:wpi="http://schemas.microsoft.com/office/word/2010/wordprocessingInk" xmlns:wne="http://schemas.microsoft.com/office/word/2006/wordml" xmlns:wps="http://schemas.microsoft.com/office/word/2010/wordprocessingShape" mc:Ignorable="w14 w15 w16se w16cid w16 w16cex w16sdtdh w16sdtfl w16du wp14">
+<w:footnotes xmlns:wpc="http://schemas.microsoft.com/office/word/2010/wordprocessingCanvas" xmlns:cx="http://schemas.microsoft.com/office/drawing/2014/chartex" xmlns:cx1="http://schemas.microsoft.com/office/drawing/2015/9/8/chartex" xmlns:cx2="http://schemas.microsoft.com/office/drawing/2015/10/21/chartex" xmlns:cx3="http://schemas.microsoft.com/office/drawing/2016/5/9/chartex" xmlns:cx4="http://schemas.microsoft.com/office/drawing/2016/5/10/chartex" xmlns:cx5="http://schemas.microsoft.com/office/drawing/2016/5/11/chartex" xmlns:cx6="http://schemas.microsoft.com/office/drawing/2016/5/12/chartex" xmlns:cx7="http://schemas.microsoft.com/office/drawing/2016/5/13/chartex" xmlns:cx8="http://schemas.microsoft.com/office/drawing/2016/5/14/chartex" xmlns:mc="http://schemas.openxmlformats.org/markup-compatibility/2006" xmlns:aink="http://schemas.microsoft.com/office/drawing/2016/ink" xmlns:am3d="http://schemas.microsoft.com/office/drawing/2017/model3d" xmlns:o="urn:schemas-microsoft-com:office:office" xmlns:oel="http://schemas.microsoft.com/office/2019/extlst" xmlns:r="http://schemas.openxmlformats.org/officeDocument/2006/relationships" xmlns:m="http://schemas.openxmlformats.org/officeDocument/2006/math" xmlns:v="urn:schemas-microsoft-com:vml" xmlns:wp14="http://schemas.microsoft.com/office/word/2010/wordprocessingDrawing" xmlns:wp="http://schemas.openxmlformats.org/drawingml/2006/wordprocessingDrawing" xmlns:w10="urn:schemas-microsoft-com:office:word" xmlns:w="http://schemas.openxmlformats.org/wordprocessingml/2006/main" xmlns:w14="http://schemas.microsoft.com/office/word/2010/wordml" xmlns:w15="http://schemas.microsoft.com/office/word/2012/wordml" xmlns:w16cex="http://schemas.microsoft.com/office/word/2018/wordml/cex" xmlns:w16cid="http://schemas.microsoft.com/office/word/2016/wordml/cid" xmlns:w16="http://schemas.microsoft.com/office/word/2018/wordml" xmlns:w16du="http://schemas.microsoft.com/office/word/2023/wordml/word16du" xmlns:w16sdtdh="http://schemas.microsoft.com/office/word/2020/wordml/sdtdatahash" xmlns:w16sdtfl="http://schemas.microsoft.com/office/word/2024/wordml/sdtformatlock" xmlns:w16se="http://schemas.microsoft.com/office/word/2015/wordml/symex" xmlns:wpg="http://schemas.microsoft.com/office/word/2010/wordprocessingGroup" xmlns:wpi="http://schemas.microsoft.com/office/word/2010/wordprocessingInk" xmlns:wne="http://schemas.microsoft.com/office/word/2006/wordml" xmlns:wps="http://schemas.microsoft.com/office/word/2010/wordprocessingShape" mc:Ignorable="w14 w15 w16se w16cid w16 w16cex w16sdtdh w16sdtfl w16du wp14">
   <w:footnote w:type="separator" w:id="-1">
     <w:p>
       <w:pPr>
@@ -15735,7 +15740,7 @@
 </file>
 
 <file path=word/header1.xml><?xml version="1.0" encoding="utf-8"?>
-<w:hdr xmlns:wpc="http://schemas.microsoft.com/office/word/2010/wordprocessingCanvas" xmlns:cx="http://schemas.microsoft.com/office/drawing/2014/chartex" xmlns:cx1="http://schemas.microsoft.com/office/drawing/2015/9/8/chartex" xmlns:cx2="http://schemas.microsoft.com/office/drawing/2015/10/21/chartex" xmlns:cx3="http://schemas.microsoft.com/office/drawing/2016/5/9/chartex" xmlns:cx4="http://schemas.microsoft.com/office/drawing/2016/5/10/chartex" xmlns:cx5="http://schemas.microsoft.com/office/drawing/2016/5/11/chartex" xmlns:cx6="http://schemas.microsoft.com/office/drawing/2016/5/12/chartex" xmlns:cx7="http://schemas.microsoft.com/office/drawing/2016/5/13/chartex" xmlns:cx8="http://schemas.microsoft.com/office/drawing/2016/5/14/chartex" xmlns:mc="http://schemas.openxmlformats.org/markup-compatibility/2006" xmlns:aink="http://schemas.microsoft.com/office/drawing/2016/ink" xmlns:am3d="http://schemas.microsoft.com/office/drawing/2017/model3d" xmlns:o="urn:schemas-microsoft-com:office:office" xmlns:oel="http://schemas.microsoft.com/office/2019/extlst" xmlns:r="http://schemas.openxmlformats.org/officeDocument/2006/relationships" xmlns:m="http://schemas.openxmlformats.org/officeDocument/2006/math" xmlns:v="urn:schemas-microsoft-com:vml" xmlns:wp14="http://schemas.microsoft.com/office/word/2010/wordprocessingDrawing" xmlns:wp="http://schemas.openxmlformats.org/drawingml/2006/wordprocessingDrawing" xmlns:w10="urn:schemas-microsoft-com:office:word" xmlns:w="http://schemas.openxmlformats.org/wordprocessingml/2006/main" xmlns:w14="http://schemas.microsoft.com/office/word/2010/wordml" xmlns:w15="http://schemas.microsoft.com/office/word/2012/wordml" xmlns:w16cei="http://schemas.microsoft.com/office/word/2026/wordml/cei" xmlns:w16cex="http://schemas.microsoft.com/office/word/2018/wordml/cex" xmlns:w16cid="http://schemas.microsoft.com/office/word/2016/wordml/cid" xmlns:w16="http://schemas.microsoft.com/office/word/2018/wordml" xmlns:w16du="http://schemas.microsoft.com/office/word/2023/wordml/word16du" xmlns:w16sdtdh="http://schemas.microsoft.com/office/word/2020/wordml/sdtdatahash" xmlns:w16sdtfl="http://schemas.microsoft.com/office/word/2024/wordml/sdtformatlock" xmlns:w16se="http://schemas.microsoft.com/office/word/2015/wordml/symex" xmlns:wpg="http://schemas.microsoft.com/office/word/2010/wordprocessingGroup" xmlns:wpi="http://schemas.microsoft.com/office/word/2010/wordprocessingInk" xmlns:wne="http://schemas.microsoft.com/office/word/2006/wordml" xmlns:wps="http://schemas.microsoft.com/office/word/2010/wordprocessingShape" mc:Ignorable="w14 w15 w16se w16cid w16 w16cex w16sdtdh w16sdtfl w16du wp14">
+<w:hdr xmlns:wpc="http://schemas.microsoft.com/office/word/2010/wordprocessingCanvas" xmlns:cx="http://schemas.microsoft.com/office/drawing/2014/chartex" xmlns:cx1="http://schemas.microsoft.com/office/drawing/2015/9/8/chartex" xmlns:cx2="http://schemas.microsoft.com/office/drawing/2015/10/21/chartex" xmlns:cx3="http://schemas.microsoft.com/office/drawing/2016/5/9/chartex" xmlns:cx4="http://schemas.microsoft.com/office/drawing/2016/5/10/chartex" xmlns:cx5="http://schemas.microsoft.com/office/drawing/2016/5/11/chartex" xmlns:cx6="http://schemas.microsoft.com/office/drawing/2016/5/12/chartex" xmlns:cx7="http://schemas.microsoft.com/office/drawing/2016/5/13/chartex" xmlns:cx8="http://schemas.microsoft.com/office/drawing/2016/5/14/chartex" xmlns:mc="http://schemas.openxmlformats.org/markup-compatibility/2006" xmlns:aink="http://schemas.microsoft.com/office/drawing/2016/ink" xmlns:am3d="http://schemas.microsoft.com/office/drawing/2017/model3d" xmlns:o="urn:schemas-microsoft-com:office:office" xmlns:oel="http://schemas.microsoft.com/office/2019/extlst" xmlns:r="http://schemas.openxmlformats.org/officeDocument/2006/relationships" xmlns:m="http://schemas.openxmlformats.org/officeDocument/2006/math" xmlns:v="urn:schemas-microsoft-com:vml" xmlns:wp14="http://schemas.microsoft.com/office/word/2010/wordprocessingDrawing" xmlns:wp="http://schemas.openxmlformats.org/drawingml/2006/wordprocessingDrawing" xmlns:w10="urn:schemas-microsoft-com:office:word" xmlns:w="http://schemas.openxmlformats.org/wordprocessingml/2006/main" xmlns:w14="http://schemas.microsoft.com/office/word/2010/wordml" xmlns:w15="http://schemas.microsoft.com/office/word/2012/wordml" xmlns:w16cex="http://schemas.microsoft.com/office/word/2018/wordml/cex" xmlns:w16cid="http://schemas.microsoft.com/office/word/2016/wordml/cid" xmlns:w16="http://schemas.microsoft.com/office/word/2018/wordml" xmlns:w16du="http://schemas.microsoft.com/office/word/2023/wordml/word16du" xmlns:w16sdtdh="http://schemas.microsoft.com/office/word/2020/wordml/sdtdatahash" xmlns:w16sdtfl="http://schemas.microsoft.com/office/word/2024/wordml/sdtformatlock" xmlns:w16se="http://schemas.microsoft.com/office/word/2015/wordml/symex" xmlns:wpg="http://schemas.microsoft.com/office/word/2010/wordprocessingGroup" xmlns:wpi="http://schemas.microsoft.com/office/word/2010/wordprocessingInk" xmlns:wne="http://schemas.microsoft.com/office/word/2006/wordml" xmlns:wps="http://schemas.microsoft.com/office/word/2010/wordprocessingShape" mc:Ignorable="w14 w15 w16se w16cid w16 w16cex w16sdtdh w16sdtfl w16du wp14">
   <w:p>
     <w:pPr>
       <w:pStyle w:val="Encabezado"/>
@@ -15962,7 +15967,7 @@
 </file>
 
 <file path=word/numbering.xml><?xml version="1.0" encoding="utf-8"?>
-<w:numbering xmlns:wpc="http://schemas.microsoft.com/office/word/2010/wordprocessingCanvas" xmlns:cx="http://schemas.microsoft.com/office/drawing/2014/chartex" xmlns:cx1="http://schemas.microsoft.com/office/drawing/2015/9/8/chartex" xmlns:cx2="http://schemas.microsoft.com/office/drawing/2015/10/21/chartex" xmlns:cx3="http://schemas.microsoft.com/office/drawing/2016/5/9/chartex" xmlns:cx4="http://schemas.microsoft.com/office/drawing/2016/5/10/chartex" xmlns:cx5="http://schemas.microsoft.com/office/drawing/2016/5/11/chartex" xmlns:cx6="http://schemas.microsoft.com/office/drawing/2016/5/12/chartex" xmlns:cx7="http://schemas.microsoft.com/office/drawing/2016/5/13/chartex" xmlns:cx8="http://schemas.microsoft.com/office/drawing/2016/5/14/chartex" xmlns:mc="http://schemas.openxmlformats.org/markup-compatibility/2006" xmlns:aink="http://schemas.microsoft.com/office/drawing/2016/ink" xmlns:am3d="http://schemas.microsoft.com/office/drawing/2017/model3d" xmlns:o="urn:schemas-microsoft-com:office:office" xmlns:oel="http://schemas.microsoft.com/office/2019/extlst" xmlns:r="http://schemas.openxmlformats.org/officeDocument/2006/relationships" xmlns:m="http://schemas.openxmlformats.org/officeDocument/2006/math" xmlns:v="urn:schemas-microsoft-com:vml" xmlns:wp14="http://schemas.microsoft.com/office/word/2010/wordprocessingDrawing" xmlns:wp="http://schemas.openxmlformats.org/drawingml/2006/wordprocessingDrawing" xmlns:w10="urn:schemas-microsoft-com:office:word" xmlns:w="http://schemas.openxmlformats.org/wordprocessingml/2006/main" xmlns:w14="http://schemas.microsoft.com/office/word/2010/wordml" xmlns:w15="http://schemas.microsoft.com/office/word/2012/wordml" xmlns:w16cei="http://schemas.microsoft.com/office/word/2026/wordml/cei" xmlns:w16cex="http://schemas.microsoft.com/office/word/2018/wordml/cex" xmlns:w16cid="http://schemas.microsoft.com/office/word/2016/wordml/cid" xmlns:w16="http://schemas.microsoft.com/office/word/2018/wordml" xmlns:w16du="http://schemas.microsoft.com/office/word/2023/wordml/word16du" xmlns:w16sdtdh="http://schemas.microsoft.com/office/word/2020/wordml/sdtdatahash" xmlns:w16sdtfl="http://schemas.microsoft.com/office/word/2024/wordml/sdtformatlock" xmlns:w16se="http://schemas.microsoft.com/office/word/2015/wordml/symex" xmlns:wpg="http://schemas.microsoft.com/office/word/2010/wordprocessingGroup" xmlns:wpi="http://schemas.microsoft.com/office/word/2010/wordprocessingInk" xmlns:wne="http://schemas.microsoft.com/office/word/2006/wordml" xmlns:wps="http://schemas.microsoft.com/office/word/2010/wordprocessingShape" mc:Ignorable="w14 w15 w16se w16cid w16 w16cex w16sdtdh w16sdtfl w16du wp14">
+<w:numbering xmlns:wpc="http://schemas.microsoft.com/office/word/2010/wordprocessingCanvas" xmlns:cx="http://schemas.microsoft.com/office/drawing/2014/chartex" xmlns:cx1="http://schemas.microsoft.com/office/drawing/2015/9/8/chartex" xmlns:cx2="http://schemas.microsoft.com/office/drawing/2015/10/21/chartex" xmlns:cx3="http://schemas.microsoft.com/office/drawing/2016/5/9/chartex" xmlns:cx4="http://schemas.microsoft.com/office/drawing/2016/5/10/chartex" xmlns:cx5="http://schemas.microsoft.com/office/drawing/2016/5/11/chartex" xmlns:cx6="http://schemas.microsoft.com/office/drawing/2016/5/12/chartex" xmlns:cx7="http://schemas.microsoft.com/office/drawing/2016/5/13/chartex" xmlns:cx8="http://schemas.microsoft.com/office/drawing/2016/5/14/chartex" xmlns:mc="http://schemas.openxmlformats.org/markup-compatibility/2006" xmlns:aink="http://schemas.microsoft.com/office/drawing/2016/ink" xmlns:am3d="http://schemas.microsoft.com/office/drawing/2017/model3d" xmlns:o="urn:schemas-microsoft-com:office:office" xmlns:oel="http://schemas.microsoft.com/office/2019/extlst" xmlns:r="http://schemas.openxmlformats.org/officeDocument/2006/relationships" xmlns:m="http://schemas.openxmlformats.org/officeDocument/2006/math" xmlns:v="urn:schemas-microsoft-com:vml" xmlns:wp14="http://schemas.microsoft.com/office/word/2010/wordprocessingDrawing" xmlns:wp="http://schemas.openxmlformats.org/drawingml/2006/wordprocessingDrawing" xmlns:w10="urn:schemas-microsoft-com:office:word" xmlns:w="http://schemas.openxmlformats.org/wordprocessingml/2006/main" xmlns:w14="http://schemas.microsoft.com/office/word/2010/wordml" xmlns:w15="http://schemas.microsoft.com/office/word/2012/wordml" xmlns:w16cex="http://schemas.microsoft.com/office/word/2018/wordml/cex" xmlns:w16cid="http://schemas.microsoft.com/office/word/2016/wordml/cid" xmlns:w16="http://schemas.microsoft.com/office/word/2018/wordml" xmlns:w16du="http://schemas.microsoft.com/office/word/2023/wordml/word16du" xmlns:w16sdtdh="http://schemas.microsoft.com/office/word/2020/wordml/sdtdatahash" xmlns:w16sdtfl="http://schemas.microsoft.com/office/word/2024/wordml/sdtformatlock" xmlns:w16se="http://schemas.microsoft.com/office/word/2015/wordml/symex" xmlns:wpg="http://schemas.microsoft.com/office/word/2010/wordprocessingGroup" xmlns:wpi="http://schemas.microsoft.com/office/word/2010/wordprocessingInk" xmlns:wne="http://schemas.microsoft.com/office/word/2006/wordml" xmlns:wps="http://schemas.microsoft.com/office/word/2010/wordprocessingShape" mc:Ignorable="w14 w15 w16se w16cid w16 w16cex w16sdtdh w16sdtfl w16du wp14">
   <w:abstractNum w:abstractNumId="0" w15:restartNumberingAfterBreak="0">
     <w:nsid w:val="FFFFFF7E"/>
     <w:multiLevelType w:val="singleLevel"/>
@@ -19738,6 +19743,7 @@
   <w:style w:type="character" w:default="1" w:styleId="Fuentedeprrafopredeter">
     <w:name w:val="Default Paragraph Font"/>
     <w:uiPriority w:val="1"/>
+    <w:semiHidden/>
     <w:unhideWhenUsed/>
   </w:style>
   <w:style w:type="table" w:default="1" w:styleId="Tablanormal">

</xml_diff>